<commit_message>
Add chess simul result to proprietary trading cover letters
Nine letters built from the proprietary trading template now cite the
21/22 simultaneous exhibition result alongside the Irish U19 placing.

Co-Authored-By: Claude Opus 5.5 <noreply@anthropic.com>
Claude-Session: https://claude.ai/code/session_018guutdydgU7KymEGGUdRZE
</commit_message>
<xml_diff>
--- a/applications/Will_McGowan_Cover_Letters_2027_Applications.docx
+++ b/applications/Will_McGowan_Cover_Letters_2027_Applications.docx
@@ -8051,7 +8051,7 @@
         <w:rPr>
           <w:b w:val="0"/>
         </w:rPr>
-        <w:t>Most of what I am proudest of comes down to good decisions made with incomplete information. My lifetime poker cash-game winnings of over £40,000 came from expected-value reasoning, disciplined bet sizing and a strict 50-buy-in bankroll rule, and I finished 14th at the Irish U19 Chess Championships in 2023. As Vice-President and then President of the Strathclyde Poker Society, I ran weekly tournaments for around 60 players on a £600-per-semester budget, reconciling every buy-in and prize pool.</w:t>
+        <w:t>Most of what I am proudest of comes down to good decisions made with incomplete information. My lifetime poker cash-game winnings of over £40,000 came from expected-value reasoning, disciplined bet sizing and a strict 50-buy-in bankroll rule. I also finished 14th at the Irish U19 Chess Championships in 2023 and won 21 of 22 games in a simultaneous exhibition against players with an average rating of 1860. As Vice-President and then President of the Strathclyde Poker Society, I ran weekly tournaments for around 60 players on a £600-per-semester budget, reconciling every buy-in and prize pool.</w:t>
       </w:r>
     </w:p>
     <w:p>
@@ -8284,7 +8284,7 @@
         <w:rPr>
           <w:b w:val="0"/>
         </w:rPr>
-        <w:t>Most of what I am proudest of comes down to good decisions made with incomplete information. My lifetime poker cash-game winnings of over £40,000 came from expected-value reasoning, disciplined bet sizing and a strict 50-buy-in bankroll rule, and I finished 14th at the Irish U19 Chess Championships in 2023. As Vice-President and then President of the Strathclyde Poker Society, I ran weekly tournaments for around 60 players on a £600-per-semester budget, reconciling every buy-in and prize pool.</w:t>
+        <w:t>Most of what I am proudest of comes down to good decisions made with incomplete information. My lifetime poker cash-game winnings of over £40,000 came from expected-value reasoning, disciplined bet sizing and a strict 50-buy-in bankroll rule. I also finished 14th at the Irish U19 Chess Championships in 2023 and won 21 of 22 games in a simultaneous exhibition against players with an average rating of 1860. As Vice-President and then President of the Strathclyde Poker Society, I ran weekly tournaments for around 60 players on a £600-per-semester budget, reconciling every buy-in and prize pool.</w:t>
       </w:r>
     </w:p>
     <w:p>
@@ -8517,7 +8517,7 @@
         <w:rPr>
           <w:b w:val="0"/>
         </w:rPr>
-        <w:t>Most of what I am proudest of comes down to good decisions made with incomplete information. My lifetime poker cash-game winnings of over £40,000 came from expected-value reasoning, disciplined bet sizing and a strict 50-buy-in bankroll rule, and I finished 14th at the Irish U19 Chess Championships in 2023. As Vice-President and then President of the Strathclyde Poker Society, I ran weekly tournaments for around 60 players on a £600-per-semester budget, reconciling every buy-in and prize pool.</w:t>
+        <w:t>Most of what I am proudest of comes down to good decisions made with incomplete information. My lifetime poker cash-game winnings of over £40,000 came from expected-value reasoning, disciplined bet sizing and a strict 50-buy-in bankroll rule. I also finished 14th at the Irish U19 Chess Championships in 2023 and won 21 of 22 games in a simultaneous exhibition against players with an average rating of 1860. As Vice-President and then President of the Strathclyde Poker Society, I ran weekly tournaments for around 60 players on a £600-per-semester budget, reconciling every buy-in and prize pool.</w:t>
       </w:r>
     </w:p>
     <w:p>
@@ -8739,7 +8739,7 @@
         <w:rPr>
           <w:b w:val="0"/>
         </w:rPr>
-        <w:t>Most of what I am proudest of comes down to good decisions made with incomplete information. My lifetime poker cash-game winnings of over £40,000 came from expected-value reasoning, disciplined bet sizing and a strict 50-buy-in bankroll rule, and I finished 14th at the Irish U19 Chess Championships in 2023. As Vice-President and then President of the Strathclyde Poker Society, I ran weekly tournaments for around 60 players on a £600-per-semester budget, reconciling every buy-in and prize pool.</w:t>
+        <w:t>Most of what I am proudest of comes down to good decisions made with incomplete information. My lifetime poker cash-game winnings of over £40,000 came from expected-value reasoning, disciplined bet sizing and a strict 50-buy-in bankroll rule. I also finished 14th at the Irish U19 Chess Championships in 2023 and won 21 of 22 games in a simultaneous exhibition against players with an average rating of 1860. As Vice-President and then President of the Strathclyde Poker Society, I ran weekly tournaments for around 60 players on a £600-per-semester budget, reconciling every buy-in and prize pool.</w:t>
       </w:r>
     </w:p>
     <w:p>

</xml_diff>

<commit_message>
Name the simul opponents' rating as FIDE
The four CVs now say "averaging 1860 FIDE", and the nine cover letters
that mention the simul say "an average FIDE rating of 1860". Every CV and
letter still fits on one page.

Co-Authored-By: Claude Opus 5.5 <noreply@anthropic.com>
Claude-Session: https://claude.ai/code/session_018guutdydgU7KymEGGUdRZE
</commit_message>
<xml_diff>
--- a/applications/Will_McGowan_Cover_Letters_2027_Applications.docx
+++ b/applications/Will_McGowan_Cover_Letters_2027_Applications.docx
@@ -8051,7 +8051,7 @@
         <w:rPr>
           <w:b w:val="0"/>
         </w:rPr>
-        <w:t>Most of what I am proudest of comes down to good decisions made with incomplete information. My lifetime poker cash-game winnings of over £40,000 came from expected-value reasoning, disciplined bet sizing and a strict 50-buy-in bankroll rule. I also finished 14th at the Irish U19 Chess Championships in 2023 and won 21 of 22 games in a simultaneous exhibition against players with an average rating of 1860. As Vice-President and then President of the Strathclyde Poker Society, I ran weekly tournaments for around 60 players on a £600-per-semester budget, reconciling every buy-in and prize pool.</w:t>
+        <w:t>Most of what I am proudest of comes down to good decisions made with incomplete information. My lifetime poker cash-game winnings of over £40,000 came from expected-value reasoning, disciplined bet sizing and a strict 50-buy-in bankroll rule. I also finished 14th at the Irish U19 Chess Championships in 2023 and won 21 of 22 games in a simultaneous exhibition against players with an average FIDE rating of 1860. As Vice-President and then President of the Strathclyde Poker Society, I ran weekly tournaments for around 60 players on a £600-per-semester budget, reconciling every buy-in and prize pool.</w:t>
       </w:r>
     </w:p>
     <w:p>
@@ -8284,7 +8284,7 @@
         <w:rPr>
           <w:b w:val="0"/>
         </w:rPr>
-        <w:t>Most of what I am proudest of comes down to good decisions made with incomplete information. My lifetime poker cash-game winnings of over £40,000 came from expected-value reasoning, disciplined bet sizing and a strict 50-buy-in bankroll rule. I also finished 14th at the Irish U19 Chess Championships in 2023 and won 21 of 22 games in a simultaneous exhibition against players with an average rating of 1860. As Vice-President and then President of the Strathclyde Poker Society, I ran weekly tournaments for around 60 players on a £600-per-semester budget, reconciling every buy-in and prize pool.</w:t>
+        <w:t>Most of what I am proudest of comes down to good decisions made with incomplete information. My lifetime poker cash-game winnings of over £40,000 came from expected-value reasoning, disciplined bet sizing and a strict 50-buy-in bankroll rule. I also finished 14th at the Irish U19 Chess Championships in 2023 and won 21 of 22 games in a simultaneous exhibition against players with an average FIDE rating of 1860. As Vice-President and then President of the Strathclyde Poker Society, I ran weekly tournaments for around 60 players on a £600-per-semester budget, reconciling every buy-in and prize pool.</w:t>
       </w:r>
     </w:p>
     <w:p>
@@ -8517,7 +8517,7 @@
         <w:rPr>
           <w:b w:val="0"/>
         </w:rPr>
-        <w:t>Most of what I am proudest of comes down to good decisions made with incomplete information. My lifetime poker cash-game winnings of over £40,000 came from expected-value reasoning, disciplined bet sizing and a strict 50-buy-in bankroll rule. I also finished 14th at the Irish U19 Chess Championships in 2023 and won 21 of 22 games in a simultaneous exhibition against players with an average rating of 1860. As Vice-President and then President of the Strathclyde Poker Society, I ran weekly tournaments for around 60 players on a £600-per-semester budget, reconciling every buy-in and prize pool.</w:t>
+        <w:t>Most of what I am proudest of comes down to good decisions made with incomplete information. My lifetime poker cash-game winnings of over £40,000 came from expected-value reasoning, disciplined bet sizing and a strict 50-buy-in bankroll rule. I also finished 14th at the Irish U19 Chess Championships in 2023 and won 21 of 22 games in a simultaneous exhibition against players with an average FIDE rating of 1860. As Vice-President and then President of the Strathclyde Poker Society, I ran weekly tournaments for around 60 players on a £600-per-semester budget, reconciling every buy-in and prize pool.</w:t>
       </w:r>
     </w:p>
     <w:p>
@@ -8739,7 +8739,7 @@
         <w:rPr>
           <w:b w:val="0"/>
         </w:rPr>
-        <w:t>Most of what I am proudest of comes down to good decisions made with incomplete information. My lifetime poker cash-game winnings of over £40,000 came from expected-value reasoning, disciplined bet sizing and a strict 50-buy-in bankroll rule. I also finished 14th at the Irish U19 Chess Championships in 2023 and won 21 of 22 games in a simultaneous exhibition against players with an average rating of 1860. As Vice-President and then President of the Strathclyde Poker Society, I ran weekly tournaments for around 60 players on a £600-per-semester budget, reconciling every buy-in and prize pool.</w:t>
+        <w:t>Most of what I am proudest of comes down to good decisions made with incomplete information. My lifetime poker cash-game winnings of over £40,000 came from expected-value reasoning, disciplined bet sizing and a strict 50-buy-in bankroll rule. I also finished 14th at the Irish U19 Chess Championships in 2023 and won 21 of 22 games in a simultaneous exhibition against players with an average FIDE rating of 1860. As Vice-President and then President of the Strathclyde Poker Society, I ran weekly tournaments for around 60 players on a £600-per-semester budget, reconciling every buy-in and prize pool.</w:t>
       </w:r>
     </w:p>
     <w:p>

</xml_diff>

<commit_message>
Update CAPM and Monte Carlo figures in the cover letters
31 letters and both packs now quote the numbers the projects print: 694
anomaly portfolios across 54 countries, GRS rejecting in 48 of 53, and a
97% cut in standard error. Every letter is still one page.

Co-Authored-By: Claude Opus 5.5 <noreply@anthropic.com>
Claude-Session: https://claude.ai/code/session_018guutdydgU7KymEGGUdRZE
</commit_message>
<xml_diff>
--- a/applications/Will_McGowan_Cover_Letters_2027_Applications.docx
+++ b/applications/Will_McGowan_Cover_Letters_2027_Applications.docx
@@ -4833,7 +4833,7 @@
         <w:rPr>
           <w:b w:val="0"/>
         </w:rPr>
-        <w:t>My academic work centres on a question asset managers answer every day: what is a return worth once its risk is understood? I tested CAPM on 704 anomaly portfolios across 56 countries and found it fails jointly in 48 of 52, with momentum and value earning the most persistent alphas. My dissertation, supervised by Dr Luigi Gifuni, forecasts European gas volatility with mixed-frequency (MIDAS) models built on storage, market and news-based data, and tests whether better risk forecasts improve a volatility-targeted futures strategy, a question that matters to any portfolio with commodity exposure.</w:t>
+        <w:t>My academic work centres on a question asset managers answer every day: what is a return worth once its risk is understood? I tested CAPM on 694 anomaly portfolios across 54 countries and found it fails jointly in 48 of 53, with momentum and value earning the most persistent alphas. My dissertation, supervised by Dr Luigi Gifuni, forecasts European gas volatility with mixed-frequency (MIDAS) models built on storage, market and news-based data, and tests whether better risk forecasts improve a volatility-targeted futures strategy, a question that matters to any portfolio with commodity exposure.</w:t>
       </w:r>
     </w:p>
     <w:p>
@@ -6908,7 +6908,7 @@
         <w:rPr>
           <w:b w:val="0"/>
         </w:rPr>
-        <w:t>My work keeps returning to one question: does an apparent edge survive a proper test? I tested CAPM on 704 anomaly portfolios across 56 countries and rejected zero alpha jointly in 48 of 52, with momentum the most persistent anomaly. My dissertation, supervised by Dr Luigi Gifuni, forecasts European gas volatility with mixed-frequency (MIDAS) models built on storage, market and news-based data, evaluates them out-of-sample against HAR and AR benchmarks, and asks whether better forecasts improve a volatility-targeted TTF futures strategy. As co-founder of the Strathclyde Agricapital Society, I also built a wheat calendar-spread strategy whose weekly backtest returned a Sharpe ratio of 0.76 before costs and 0.28 after, which taught me how quickly turnover erodes an edge.</w:t>
+        <w:t>My work keeps returning to one question: does an apparent edge survive a proper test? I tested CAPM on 694 anomaly portfolios across 54 countries and rejected zero alpha jointly in 48 of 53, with momentum the most persistent anomaly. My dissertation, supervised by Dr Luigi Gifuni, forecasts European gas volatility with mixed-frequency (MIDAS) models built on storage, market and news-based data, evaluates them out-of-sample against HAR and AR benchmarks, and asks whether better forecasts improve a volatility-targeted TTF futures strategy. As co-founder of the Strathclyde Agricapital Society, I also built a wheat calendar-spread strategy whose weekly backtest returned a Sharpe ratio of 0.76 before costs and 0.28 after, which taught me how quickly turnover erodes an edge.</w:t>
       </w:r>
     </w:p>
     <w:p>
@@ -7130,7 +7130,7 @@
         <w:rPr>
           <w:b w:val="0"/>
         </w:rPr>
-        <w:t>My work keeps returning to one question: does an apparent edge survive a proper test? I tested CAPM on 704 anomaly portfolios across 56 countries and rejected zero alpha jointly in 48 of 52, with momentum the most persistent anomaly. My dissertation, supervised by Dr Luigi Gifuni, forecasts European gas volatility with mixed-frequency (MIDAS) models built on storage, market and news-based data, evaluates them out-of-sample against HAR and AR benchmarks, and asks whether better forecasts improve a volatility-targeted TTF futures strategy. As co-founder of the Strathclyde Agricapital Society, I also built a wheat calendar-spread strategy whose weekly backtest returned a Sharpe ratio of 0.76 before costs and 0.28 after, which taught me how quickly turnover erodes an edge.</w:t>
+        <w:t>My work keeps returning to one question: does an apparent edge survive a proper test? I tested CAPM on 694 anomaly portfolios across 54 countries and rejected zero alpha jointly in 48 of 53, with momentum the most persistent anomaly. My dissertation, supervised by Dr Luigi Gifuni, forecasts European gas volatility with mixed-frequency (MIDAS) models built on storage, market and news-based data, evaluates them out-of-sample against HAR and AR benchmarks, and asks whether better forecasts improve a volatility-targeted TTF futures strategy. As co-founder of the Strathclyde Agricapital Society, I also built a wheat calendar-spread strategy whose weekly backtest returned a Sharpe ratio of 0.76 before costs and 0.28 after, which taught me how quickly turnover erodes an edge.</w:t>
       </w:r>
     </w:p>
     <w:p>
@@ -7363,7 +7363,7 @@
         <w:rPr>
           <w:b w:val="0"/>
         </w:rPr>
-        <w:t>My work keeps returning to one question: does an apparent edge survive a proper test? I tested CAPM on 704 anomaly portfolios across 56 countries and rejected zero alpha jointly in 48 of 52, with momentum the most persistent anomaly. My dissertation, supervised by Dr Luigi Gifuni, forecasts European gas volatility with mixed-frequency (MIDAS) models built on storage, market and news-based data, evaluates them out-of-sample against HAR and AR benchmarks, and asks whether better forecasts improve a volatility-targeted TTF futures strategy. As co-founder of the Strathclyde Agricapital Society, I also built a wheat calendar-spread strategy whose weekly backtest returned a Sharpe ratio of 0.76 before costs and 0.28 after, which taught me how quickly turnover erodes an edge.</w:t>
+        <w:t>My work keeps returning to one question: does an apparent edge survive a proper test? I tested CAPM on 694 anomaly portfolios across 54 countries and rejected zero alpha jointly in 48 of 53, with momentum the most persistent anomaly. My dissertation, supervised by Dr Luigi Gifuni, forecasts European gas volatility with mixed-frequency (MIDAS) models built on storage, market and news-based data, evaluates them out-of-sample against HAR and AR benchmarks, and asks whether better forecasts improve a volatility-targeted TTF futures strategy. As co-founder of the Strathclyde Agricapital Society, I also built a wheat calendar-spread strategy whose weekly backtest returned a Sharpe ratio of 0.76 before costs and 0.28 after, which taught me how quickly turnover erodes an edge.</w:t>
       </w:r>
     </w:p>
     <w:p>
@@ -7596,7 +7596,7 @@
         <w:rPr>
           <w:b w:val="0"/>
         </w:rPr>
-        <w:t>My work keeps returning to one question: does an apparent edge survive a proper test? I tested CAPM on 704 anomaly portfolios across 56 countries and rejected zero alpha jointly in 48 of 52, with momentum the most persistent anomaly. My dissertation, supervised by Dr Luigi Gifuni, forecasts European gas volatility with mixed-frequency (MIDAS) models built on storage, market and news-based data, evaluates them out-of-sample against HAR and AR benchmarks, and asks whether better forecasts improve a volatility-targeted TTF futures strategy. As co-founder of the Strathclyde Agricapital Society, I also built a wheat calendar-spread strategy whose weekly backtest returned a Sharpe ratio of 0.76 before costs and 0.28 after, which taught me how quickly turnover erodes an edge.</w:t>
+        <w:t>My work keeps returning to one question: does an apparent edge survive a proper test? I tested CAPM on 694 anomaly portfolios across 54 countries and rejected zero alpha jointly in 48 of 53, with momentum the most persistent anomaly. My dissertation, supervised by Dr Luigi Gifuni, forecasts European gas volatility with mixed-frequency (MIDAS) models built on storage, market and news-based data, evaluates them out-of-sample against HAR and AR benchmarks, and asks whether better forecasts improve a volatility-targeted TTF futures strategy. As co-founder of the Strathclyde Agricapital Society, I also built a wheat calendar-spread strategy whose weekly backtest returned a Sharpe ratio of 0.76 before costs and 0.28 after, which taught me how quickly turnover erodes an edge.</w:t>
       </w:r>
     </w:p>
     <w:p>
@@ -7818,7 +7818,7 @@
         <w:rPr>
           <w:b w:val="0"/>
         </w:rPr>
-        <w:t>My work keeps returning to one question: does an apparent edge survive a proper test? I tested CAPM on 704 anomaly portfolios across 56 countries and rejected zero alpha jointly in 48 of 52, with momentum the most persistent anomaly. My dissertation, supervised by Dr Luigi Gifuni, forecasts European gas volatility with mixed-frequency (MIDAS) models built on storage, market and news-based data, evaluates them out-of-sample against HAR and AR benchmarks, and asks whether better forecasts improve a volatility-targeted TTF futures strategy. As co-founder of the Strathclyde Agricapital Society, I also built a wheat calendar-spread strategy whose weekly backtest returned a Sharpe ratio of 0.76 before costs and 0.28 after, which taught me how quickly turnover erodes an edge.</w:t>
+        <w:t>My work keeps returning to one question: does an apparent edge survive a proper test? I tested CAPM on 694 anomaly portfolios across 54 countries and rejected zero alpha jointly in 48 of 53, with momentum the most persistent anomaly. My dissertation, supervised by Dr Luigi Gifuni, forecasts European gas volatility with mixed-frequency (MIDAS) models built on storage, market and news-based data, evaluates them out-of-sample against HAR and AR benchmarks, and asks whether better forecasts improve a volatility-targeted TTF futures strategy. As co-founder of the Strathclyde Agricapital Society, I also built a wheat calendar-spread strategy whose weekly backtest returned a Sharpe ratio of 0.76 before costs and 0.28 after, which taught me how quickly turnover erodes an edge.</w:t>
       </w:r>
     </w:p>
     <w:p>
@@ -8062,7 +8062,7 @@
         <w:rPr>
           <w:b w:val="0"/>
         </w:rPr>
-        <w:t>I pair that instinct with quantitative work I can defend line by line. I built a Monte Carlo option pricer in which a geometric-Asian control variate cut the standard error of arithmetic-Asian estimates by 97.24% at 100,000 paths, and my dissertation forecasts European gas volatility with mixed-frequency (MIDAS) models, testing whether better forecasts improve a volatility-targeted TTF futures strategy. Proprietary trading appeals to me because the feedback is immediate and impartial: every decision is priced, and improving means learning faster than the market. Nearly two years of busy bar shifts alongside full-time study, and now running the drinks programme as Head Mixologist at a new 200-cover Glasgow venue, have taught me to stay accurate when speed matters.</w:t>
+        <w:t>I pair that instinct with quantitative work I can defend line by line. I built a Monte Carlo option pricer in which a geometric-Asian control variate cut the standard error of arithmetic-Asian estimates by 97% at 100,000 paths, and my dissertation forecasts European gas volatility with mixed-frequency (MIDAS) models, testing whether better forecasts improve a volatility-targeted TTF futures strategy. Proprietary trading appeals to me because the feedback is immediate and impartial: every decision is priced, and improving means learning faster than the market. Nearly two years of busy bar shifts alongside full-time study, and now running the drinks programme as Head Mixologist at a new 200-cover Glasgow venue, have taught me to stay accurate when speed matters.</w:t>
       </w:r>
     </w:p>
     <w:p>
@@ -8295,7 +8295,7 @@
         <w:rPr>
           <w:b w:val="0"/>
         </w:rPr>
-        <w:t>I pair that instinct with quantitative work I can defend line by line. I built a Monte Carlo option pricer in which a geometric-Asian control variate cut the standard error of arithmetic-Asian estimates by 97.24% at 100,000 paths, and my dissertation forecasts European gas volatility with mixed-frequency (MIDAS) models, testing whether better forecasts improve a volatility-targeted TTF futures strategy. Proprietary trading appeals to me because the feedback is immediate and impartial: every decision is priced, and improving means learning faster than the market. Nearly two years of busy bar shifts alongside full-time study, and now running the drinks programme as Head Mixologist at a new 200-cover Glasgow venue, have taught me to stay accurate when speed matters.</w:t>
+        <w:t>I pair that instinct with quantitative work I can defend line by line. I built a Monte Carlo option pricer in which a geometric-Asian control variate cut the standard error of arithmetic-Asian estimates by 97% at 100,000 paths, and my dissertation forecasts European gas volatility with mixed-frequency (MIDAS) models, testing whether better forecasts improve a volatility-targeted TTF futures strategy. Proprietary trading appeals to me because the feedback is immediate and impartial: every decision is priced, and improving means learning faster than the market. Nearly two years of busy bar shifts alongside full-time study, and now running the drinks programme as Head Mixologist at a new 200-cover Glasgow venue, have taught me to stay accurate when speed matters.</w:t>
       </w:r>
     </w:p>
     <w:p>
@@ -8528,7 +8528,7 @@
         <w:rPr>
           <w:b w:val="0"/>
         </w:rPr>
-        <w:t>I pair that instinct with quantitative work I can defend line by line. I built a Monte Carlo option pricer in which a geometric-Asian control variate cut the standard error of arithmetic-Asian estimates by 97.24% at 100,000 paths, and my dissertation forecasts European gas volatility with mixed-frequency (MIDAS) models, testing whether better forecasts improve a volatility-targeted TTF futures strategy. Proprietary trading appeals to me because the feedback is immediate and impartial: every decision is priced, and improving means learning faster than the market. Nearly two years of busy bar shifts alongside full-time study, and now running the drinks programme as Head Mixologist at a new 200-cover Glasgow venue, have taught me to stay accurate when speed matters.</w:t>
+        <w:t>I pair that instinct with quantitative work I can defend line by line. I built a Monte Carlo option pricer in which a geometric-Asian control variate cut the standard error of arithmetic-Asian estimates by 97% at 100,000 paths, and my dissertation forecasts European gas volatility with mixed-frequency (MIDAS) models, testing whether better forecasts improve a volatility-targeted TTF futures strategy. Proprietary trading appeals to me because the feedback is immediate and impartial: every decision is priced, and improving means learning faster than the market. Nearly two years of busy bar shifts alongside full-time study, and now running the drinks programme as Head Mixologist at a new 200-cover Glasgow venue, have taught me to stay accurate when speed matters.</w:t>
       </w:r>
     </w:p>
     <w:p>
@@ -8750,7 +8750,7 @@
         <w:rPr>
           <w:b w:val="0"/>
         </w:rPr>
-        <w:t>I pair that instinct with quantitative work I can defend line by line. I built a Monte Carlo option pricer in which a geometric-Asian control variate cut the standard error of arithmetic-Asian estimates by 97.24% at 100,000 paths, and my dissertation forecasts European gas volatility with mixed-frequency (MIDAS) models, testing whether better forecasts improve a volatility-targeted TTF futures strategy. Proprietary trading appeals to me because the feedback is immediate and impartial: every decision is priced, and improving means learning faster than the market. Nearly two years of busy bar shifts alongside full-time study, and now running the drinks programme as Head Mixologist at a new 200-cover Glasgow venue, have taught me to stay accurate when speed matters.</w:t>
+        <w:t>I pair that instinct with quantitative work I can defend line by line. I built a Monte Carlo option pricer in which a geometric-Asian control variate cut the standard error of arithmetic-Asian estimates by 97% at 100,000 paths, and my dissertation forecasts European gas volatility with mixed-frequency (MIDAS) models, testing whether better forecasts improve a volatility-targeted TTF futures strategy. Proprietary trading appeals to me because the feedback is immediate and impartial: every decision is priced, and improving means learning faster than the market. Nearly two years of busy bar shifts alongside full-time study, and now running the drinks programme as Head Mixologist at a new 200-cover Glasgow venue, have taught me to stay accurate when speed matters.</w:t>
       </w:r>
     </w:p>
     <w:p>
@@ -8972,7 +8972,7 @@
         <w:rPr>
           <w:b w:val="0"/>
         </w:rPr>
-        <w:t>My dissertation, supervised by Dr Luigi Gifuni, asks whether the news pays when forecasting European gas volatility. I am building a mixed-frequency (MIDAS) model in MATLAB that combines daily storage, market and news-based data, including a gas-market attention index I am constructing from Google Trends. I will evaluate it out-of-sample against HAR and AR benchmarks using Diebold-Mariano tests, then compare the Sharpe ratios of a volatility-targeted TTF futures strategy built on each model. Earlier, I built a Monte Carlo option pricer in which a geometric-Asian control variate cut the standard error of arithmetic-Asian estimates by 97.24% at 100,000 paths, and tested corn and soybean prices for cointegration in R. I work mainly in R and MATLAB and am strengthening my Python.</w:t>
+        <w:t>My dissertation, supervised by Dr Luigi Gifuni, asks whether the news pays when forecasting European gas volatility. I am building a mixed-frequency (MIDAS) model in MATLAB that combines daily storage, market and news-based data, including a gas-market attention index I am constructing from Google Trends. I will evaluate it out-of-sample against HAR and AR benchmarks using Diebold-Mariano tests, then compare the Sharpe ratios of a volatility-targeted TTF futures strategy built on each model. Earlier, I built a Monte Carlo option pricer in which a geometric-Asian control variate cut the standard error of arithmetic-Asian estimates by 97% at 100,000 paths, and tested corn and soybean prices for cointegration in R. I work mainly in R and MATLAB and am strengthening my Python.</w:t>
       </w:r>
     </w:p>
     <w:p>
@@ -9205,7 +9205,7 @@
         <w:rPr>
           <w:b w:val="0"/>
         </w:rPr>
-        <w:t>My academic work centres on a question asset managers answer every day: what is a return worth once its risk is understood? I tested CAPM on 704 anomaly portfolios across 56 countries and found it fails jointly in 48 of 52, with momentum and value earning the most persistent alphas. My dissertation, supervised by Dr Luigi Gifuni, forecasts European gas volatility with mixed-frequency (MIDAS) models built on storage, market and news-based data, and tests whether better risk forecasts improve a volatility-targeted futures strategy, a question that matters to any portfolio with commodity exposure.</w:t>
+        <w:t>My academic work centres on a question asset managers answer every day: what is a return worth once its risk is understood? I tested CAPM on 694 anomaly portfolios across 54 countries and found it fails jointly in 48 of 53, with momentum and value earning the most persistent alphas. My dissertation, supervised by Dr Luigi Gifuni, forecasts European gas volatility with mixed-frequency (MIDAS) models built on storage, market and news-based data, and tests whether better risk forecasts improve a volatility-targeted futures strategy, a question that matters to any portfolio with commodity exposure.</w:t>
       </w:r>
     </w:p>
     <w:p>
@@ -9438,7 +9438,7 @@
         <w:rPr>
           <w:b w:val="0"/>
         </w:rPr>
-        <w:t>Equity research rewards a view that is stated plainly and tested honestly, and that is how I try to work. My dissertation, supervised by Dr Luigi Gifuni, asks whether news improves forecasts of European gas volatility: I am building mixed-frequency (MIDAS) models from daily storage, market and news-based data, testing them out-of-sample against established benchmarks and asking whether better forecasts carry economic value. I also tested CAPM on 704 anomaly portfolios across 56 countries, finding that momentum and value alphas survive statistical scrutiny far more often than size, and my final-year modules include Industrial Economics and Natural Resource, Environmental and Energy Economics, which give me a framework for how industries compete.</w:t>
+        <w:t>Equity research rewards a view that is stated plainly and tested honestly, and that is how I try to work. My dissertation, supervised by Dr Luigi Gifuni, asks whether news improves forecasts of European gas volatility: I am building mixed-frequency (MIDAS) models from daily storage, market and news-based data, testing them out-of-sample against established benchmarks and asking whether better forecasts carry economic value. I also tested CAPM on 694 anomaly portfolios across 54 countries, finding that momentum and value alphas survive statistical scrutiny far more often than size, and my final-year modules include Industrial Economics and Natural Resource, Environmental and Energy Economics, which give me a framework for how industries compete.</w:t>
       </w:r>
     </w:p>
     <w:p>
@@ -9671,7 +9671,7 @@
         <w:rPr>
           <w:b w:val="0"/>
         </w:rPr>
-        <w:t>My academic work centres on a question asset managers answer every day: what is a return worth once its risk is understood? I tested CAPM on 704 anomaly portfolios across 56 countries and found it fails jointly in 48 of 52, with momentum and value earning the most persistent alphas. My dissertation, supervised by Dr Luigi Gifuni, forecasts European gas volatility with mixed-frequency (MIDAS) models built on storage, market and news-based data, and tests whether better risk forecasts improve a volatility-targeted futures strategy, a question that matters to any portfolio with commodity exposure.</w:t>
+        <w:t>My academic work centres on a question asset managers answer every day: what is a return worth once its risk is understood? I tested CAPM on 694 anomaly portfolios across 54 countries and found it fails jointly in 48 of 53, with momentum and value earning the most persistent alphas. My dissertation, supervised by Dr Luigi Gifuni, forecasts European gas volatility with mixed-frequency (MIDAS) models built on storage, market and news-based data, and tests whether better risk forecasts improve a volatility-targeted futures strategy, a question that matters to any portfolio with commodity exposure.</w:t>
       </w:r>
     </w:p>
     <w:p>
@@ -9904,7 +9904,7 @@
         <w:rPr>
           <w:b w:val="0"/>
         </w:rPr>
-        <w:t>My academic work centres on a question asset managers answer every day: what is a return worth once its risk is understood? I tested CAPM on 704 anomaly portfolios across 56 countries and found it fails jointly in 48 of 52, with momentum and value earning the most persistent alphas. My dissertation, supervised by Dr Luigi Gifuni, forecasts European gas volatility with mixed-frequency (MIDAS) models built on storage, market and news-based data, and tests whether better risk forecasts improve a volatility-targeted futures strategy, a question that matters to any portfolio with commodity exposure.</w:t>
+        <w:t>My academic work centres on a question asset managers answer every day: what is a return worth once its risk is understood? I tested CAPM on 694 anomaly portfolios across 54 countries and found it fails jointly in 48 of 53, with momentum and value earning the most persistent alphas. My dissertation, supervised by Dr Luigi Gifuni, forecasts European gas volatility with mixed-frequency (MIDAS) models built on storage, market and news-based data, and tests whether better risk forecasts improve a volatility-targeted futures strategy, a question that matters to any portfolio with commodity exposure.</w:t>
       </w:r>
     </w:p>
     <w:p>
@@ -10137,7 +10137,7 @@
         <w:rPr>
           <w:b w:val="0"/>
         </w:rPr>
-        <w:t>Equity research rewards a view that is stated plainly and tested honestly, and that is how I try to work. My dissertation, supervised by Dr Luigi Gifuni, asks whether news improves forecasts of European gas volatility: I am building mixed-frequency (MIDAS) models from daily storage, market and news-based data, testing them out-of-sample against established benchmarks and asking whether better forecasts carry economic value. I also tested CAPM on 704 anomaly portfolios across 56 countries, finding that momentum and value alphas survive statistical scrutiny far more often than size, and my final-year modules include Industrial Economics and Natural Resource, Environmental and Energy Economics, which give me a framework for how industries compete.</w:t>
+        <w:t>Equity research rewards a view that is stated plainly and tested honestly, and that is how I try to work. My dissertation, supervised by Dr Luigi Gifuni, asks whether news improves forecasts of European gas volatility: I am building mixed-frequency (MIDAS) models from daily storage, market and news-based data, testing them out-of-sample against established benchmarks and asking whether better forecasts carry economic value. I also tested CAPM on 694 anomaly portfolios across 54 countries, finding that momentum and value alphas survive statistical scrutiny far more often than size, and my final-year modules include Industrial Economics and Natural Resource, Environmental and Energy Economics, which give me a framework for how industries compete.</w:t>
       </w:r>
     </w:p>
     <w:p>

</xml_diff>

<commit_message>
Add one Word document with all 70 cover letters and their links
Each letter sits on its own page under the firm, programme and a clickable
application link, after an index table of all 70 roles. Firm paragraphs
that quoted the old CAPM figures (704 portfolios, 56 countries) now match
the project, two no longer claim Python, and Kiltearn's letter has its
registered address and a Companies House link.

Co-Authored-By: Claude Opus 5.5 <noreply@anthropic.com>
Claude-Session: https://claude.ai/code/session_018guutdydgU7KymEGGUdRZE
</commit_message>
<xml_diff>
--- a/applications/Will_McGowan_Cover_Letters_2027_Applications.docx
+++ b/applications/Will_McGowan_Cover_Letters_2027_Applications.docx
@@ -4855,7 +4855,7 @@
         <w:rPr>
           <w:b w:val="0"/>
         </w:rPr>
-        <w:t>Partners Group's Portfolio Solutions team stands out to me because it covers the whole chain from relative-value views to portfolio construction and monitoring across private markets, and bespoke solutions made up a clear majority of the firm's record fundraising in the first half of 2026. Private assets make risk harder to measure because their prices are observed infrequently, and my work forecasting volatility with mixed-frequency data, alongside testing CAPM across 704 portfolios, has given me a grounding in exactly the econometrics that problem needs.</w:t>
+        <w:t>Partners Group's Portfolio Solutions team stands out to me because it covers the whole chain from relative-value views to portfolio construction and monitoring across private markets, and bespoke solutions made up a clear majority of the firm's record fundraising in the first half of 2026. Private assets make risk harder to measure because their prices are observed infrequently, and my work forecasting volatility with mixed-frequency data, alongside testing CAPM across 694 portfolios, has given me a grounding in exactly the econometrics that problem needs.</w:t>
       </w:r>
     </w:p>
     <w:p>
@@ -7618,7 +7618,7 @@
         <w:rPr>
           <w:b w:val="0"/>
         </w:rPr>
-        <w:t>Man Group stands out to me because it runs systematic and discretionary investing on one platform, and clients have responded: assets under management reached a record $253.6 billion at the end of June 2026, with $7.1 billion of net inflows in the first half. The Solutions programme's mix of portfolio management, quant and advisory rotations fits how I like to work, from testing which factor premia survive across 56 countries to explaining the results to people who need to act on them.</w:t>
+        <w:t>Man Group stands out to me because it runs systematic and discretionary investing on one platform, and clients have responded: assets under management reached a record $253.6 billion at the end of June 2026, with $7.1 billion of net inflows in the first half. The Solutions programme's mix of portfolio management, quant and advisory rotations fits how I like to work, from testing which factor premia survive across 54 countries to explaining the results to people who need to act on them.</w:t>
       </w:r>
     </w:p>
     <w:p>
@@ -8506,7 +8506,7 @@
         <w:rPr>
           <w:b w:val="0"/>
         </w:rPr>
-        <w:t>I am applying for the Graduate Quantitative Trader (2027 start) role in London or Amsterdam. I am a final-year Economics student at the University of Strathclyde, graduating in summer 2027 with a predicted 2:1. IMC's graduate programme explicitly welcomes econometrics students and values Python, MATLAB or R, which matches how I have trained myself to think about markets.</w:t>
+        <w:t>I am applying for the Graduate Quantitative Trader (2027 start) role in London or Amsterdam. I am a final-year Economics student at the University of Strathclyde, graduating in summer 2027 with a predicted 2:1. IMC's graduate programme explicitly welcomes econometrics students and values MATLAB and R as well as Python, the two languages I use for all my research.</w:t>
       </w:r>
     </w:p>
     <w:p>
@@ -10159,7 +10159,7 @@
         <w:rPr>
           <w:b w:val="0"/>
         </w:rPr>
-        <w:t>Janus Henderson stands out to me because it is moving into private ownership under Trian and General Catalyst after regulators approved the deal in June 2026, keeping its management team and London headquarters and giving its equity teams room to think long term. The programme's blend of quantitative financial analysis and qualitative research matches how I work: my CAPM study tested 704 portfolios statistically, but explaining deals such as Olam Agri's stake sale to SALIC taught me that numbers only matter once you understand the business behind them.</w:t>
+        <w:t>Janus Henderson stands out to me because it is moving into private ownership under Trian and General Catalyst after regulators approved the deal in June 2026, keeping its management team and London headquarters and giving its equity teams room to think long term. The programme's blend of quantitative financial analysis and qualitative research matches how I work: my CAPM study tested 694 portfolios statistically, but explaining deals such as Olam Agri's stake sale to SALIC taught me that numbers only matter once you understand the business behind them.</w:t>
       </w:r>
     </w:p>
     <w:p>
@@ -10847,7 +10847,7 @@
         <w:rPr>
           <w:b w:val="0"/>
         </w:rPr>
-        <w:t>Oxera stands out to me because its graduate analysts apply serious empirical analysis to live competition, regulation and valuation questions, with dedicated tracks in data science and econometrics, finance and valuation, and competition and market design. My dissertation combines mixed-frequency econometrics with a new text-based data source, and my CAPM study ran asset-pricing tests across 56 countries; I would like to bring those skills to questions where the answer shapes a regulator's decision.</w:t>
+        <w:t>Oxera stands out to me because its graduate analysts apply serious empirical analysis to live competition, regulation and valuation questions, with dedicated tracks in data science and econometrics, finance and valuation, and competition and market design. My dissertation combines mixed-frequency econometrics with a new text-based data source, and my CAPM study ran asset-pricing tests across 54 countries; I would like to bring those skills to questions where the answer shapes a regulator's decision.</w:t>
       </w:r>
     </w:p>
     <w:p>

</xml_diff>